<commit_message>
Deploying to gh-pages from @ hljia/hljia.github.io@a3557c3693f38f3e377cd367ee555a91743f2d62 🚀
</commit_message>
<xml_diff>
--- a/assets/pdf/Hailing_Jia-CV.docx
+++ b/assets/pdf/Hailing_Jia-CV.docx
@@ -42,7 +42,7 @@
                     <pic:cNvPicPr/>
                   </pic:nvPicPr>
                   <pic:blipFill rotWithShape="1">
-                    <a:blip r:embed="rId5" cstate="print">
+                    <a:blip r:embed="rId6" cstate="print">
                       <a:extLst>
                         <a:ext uri="{28A0092B-C50C-407E-A947-70E740481C1C}">
                           <a14:useLocalDpi xmlns:a14="http://schemas.microsoft.com/office/drawing/2010/main" val="0"/>
@@ -179,7 +179,7 @@
         </w:rPr>
         <w:t xml:space="preserve">E-Mail: </w:t>
       </w:r>
-      <w:hyperlink r:id="rId6" w:history="1">
+      <w:hyperlink r:id="rId7" w:history="1">
         <w:r>
           <w:rPr>
             <w:rStyle w:val="Hyperlink"/>
@@ -1173,6 +1173,155 @@
           <w:b/>
           <w:bCs/>
         </w:rPr>
+        <w:t>Jia, H.</w:t>
+      </w:r>
+      <w:r>
+        <w:rPr>
+          <w:rFonts w:ascii="Times New Roman" w:hAnsi="Times New Roman" w:cs="Times New Roman"/>
+          <w:b/>
+          <w:bCs/>
+        </w:rPr>
+        <w:t>*</w:t>
+      </w:r>
+      <w:r>
+        <w:rPr>
+          <w:rFonts w:ascii="Times New Roman" w:hAnsi="Times New Roman" w:cs="Times New Roman"/>
+        </w:rPr>
+        <w:t xml:space="preserve">, Neubauer, D., Bhatti, Y., Watson-Parris, D., Stier, P., Quaas, J., Partridge, D., Arifi, A., Kubin, A., </w:t>
+      </w:r>
+      <w:proofErr w:type="spellStart"/>
+      <w:r>
+        <w:rPr>
+          <w:rFonts w:ascii="Times New Roman" w:hAnsi="Times New Roman" w:cs="Times New Roman"/>
+        </w:rPr>
+        <w:t>Nenes</w:t>
+      </w:r>
+      <w:proofErr w:type="spellEnd"/>
+      <w:r>
+        <w:rPr>
+          <w:rFonts w:ascii="Times New Roman" w:hAnsi="Times New Roman" w:cs="Times New Roman"/>
+        </w:rPr>
+        <w:t xml:space="preserve">, A., Irfan, M., </w:t>
+      </w:r>
+      <w:proofErr w:type="spellStart"/>
+      <w:r>
+        <w:rPr>
+          <w:rFonts w:ascii="Times New Roman" w:hAnsi="Times New Roman" w:cs="Times New Roman"/>
+        </w:rPr>
+        <w:t>Im</w:t>
+      </w:r>
+      <w:proofErr w:type="spellEnd"/>
+      <w:r>
+        <w:rPr>
+          <w:rFonts w:ascii="Times New Roman" w:hAnsi="Times New Roman" w:cs="Times New Roman"/>
+        </w:rPr>
+        <w:t xml:space="preserve">, U., </w:t>
+      </w:r>
+      <w:proofErr w:type="spellStart"/>
+      <w:r>
+        <w:rPr>
+          <w:rFonts w:ascii="Times New Roman" w:hAnsi="Times New Roman" w:cs="Times New Roman"/>
+        </w:rPr>
+        <w:t>Svenhag</w:t>
+      </w:r>
+      <w:proofErr w:type="spellEnd"/>
+      <w:r>
+        <w:rPr>
+          <w:rFonts w:ascii="Times New Roman" w:hAnsi="Times New Roman" w:cs="Times New Roman"/>
+        </w:rPr>
+        <w:t xml:space="preserve">, C., Schutgens, N., van </w:t>
+      </w:r>
+      <w:proofErr w:type="spellStart"/>
+      <w:r>
+        <w:rPr>
+          <w:rFonts w:ascii="Times New Roman" w:hAnsi="Times New Roman" w:cs="Times New Roman"/>
+        </w:rPr>
+        <w:t>Diedenhoven</w:t>
+      </w:r>
+      <w:proofErr w:type="spellEnd"/>
+      <w:r>
+        <w:rPr>
+          <w:rFonts w:ascii="Times New Roman" w:hAnsi="Times New Roman" w:cs="Times New Roman"/>
+        </w:rPr>
+        <w:t xml:space="preserve">, B., </w:t>
+      </w:r>
+      <w:proofErr w:type="spellStart"/>
+      <w:r>
+        <w:rPr>
+          <w:rFonts w:ascii="Times New Roman" w:hAnsi="Times New Roman" w:cs="Times New Roman"/>
+        </w:rPr>
+        <w:t>Ferrachat</w:t>
+      </w:r>
+      <w:proofErr w:type="spellEnd"/>
+      <w:r>
+        <w:rPr>
+          <w:rFonts w:ascii="Times New Roman" w:hAnsi="Times New Roman" w:cs="Times New Roman"/>
+        </w:rPr>
+        <w:t xml:space="preserve">, S., Lohmann, U., Tegen, I., Henkes, A., Fu, G., and </w:t>
+      </w:r>
+      <w:proofErr w:type="spellStart"/>
+      <w:r>
+        <w:rPr>
+          <w:rFonts w:ascii="Times New Roman" w:hAnsi="Times New Roman" w:cs="Times New Roman"/>
+        </w:rPr>
+        <w:t>Hasekamp</w:t>
+      </w:r>
+      <w:proofErr w:type="spellEnd"/>
+      <w:r>
+        <w:rPr>
+          <w:rFonts w:ascii="Times New Roman" w:hAnsi="Times New Roman" w:cs="Times New Roman"/>
+        </w:rPr>
+        <w:t xml:space="preserve">, O.: </w:t>
+      </w:r>
+      <w:hyperlink r:id="rId8" w:history="1">
+        <w:r>
+          <w:rPr>
+            <w:rStyle w:val="Hyperlink"/>
+            <w:rFonts w:ascii="Times New Roman" w:hAnsi="Times New Roman" w:cs="Times New Roman"/>
+          </w:rPr>
+          <w:t>Process-level contributions to uncertainty in aerosol effective radiative forcing: a perturbed parameter ensemble with the aerosol–climate model ICON–HAM</w:t>
+        </w:r>
+      </w:hyperlink>
+      <w:r>
+        <w:rPr>
+          <w:rFonts w:ascii="Times New Roman" w:hAnsi="Times New Roman" w:cs="Times New Roman"/>
+        </w:rPr>
+        <w:t xml:space="preserve">, </w:t>
+      </w:r>
+      <w:proofErr w:type="spellStart"/>
+      <w:r>
+        <w:rPr>
+          <w:rFonts w:ascii="Times New Roman" w:hAnsi="Times New Roman" w:cs="Times New Roman"/>
+        </w:rPr>
+        <w:t>EGUsphere</w:t>
+      </w:r>
+      <w:proofErr w:type="spellEnd"/>
+      <w:r>
+        <w:rPr>
+          <w:rFonts w:ascii="Times New Roman" w:hAnsi="Times New Roman" w:cs="Times New Roman"/>
+        </w:rPr>
+        <w:t xml:space="preserve"> [preprint], 2026.</w:t>
+      </w:r>
+    </w:p>
+    <w:p>
+      <w:pPr>
+        <w:pStyle w:val="ListParagraph"/>
+        <w:numPr>
+          <w:ilvl w:val="0"/>
+          <w:numId w:val="1"/>
+        </w:numPr>
+        <w:spacing w:line="48" w:lineRule="auto"/>
+        <w:jc w:val="both"/>
+        <w:rPr>
+          <w:rFonts w:ascii="Times New Roman" w:hAnsi="Times New Roman" w:cs="Times New Roman"/>
+        </w:rPr>
+      </w:pPr>
+      <w:r>
+        <w:rPr>
+          <w:rFonts w:ascii="Times New Roman" w:hAnsi="Times New Roman" w:cs="Times New Roman"/>
+          <w:b/>
+          <w:bCs/>
+        </w:rPr>
         <w:t>Jia H.*,</w:t>
       </w:r>
       <w:r>
@@ -1235,7 +1384,7 @@
         </w:rPr>
         <w:t xml:space="preserve"> </w:t>
       </w:r>
-      <w:hyperlink r:id="rId7" w:history="1">
+      <w:hyperlink r:id="rId9" w:history="1">
         <w:r>
           <w:rPr>
             <w:rStyle w:val="Hyperlink"/>
@@ -1426,7 +1575,7 @@
         </w:rPr>
         <w:t xml:space="preserve">, O. P.: </w:t>
       </w:r>
-      <w:hyperlink r:id="rId8" w:history="1">
+      <w:hyperlink r:id="rId10" w:history="1">
         <w:r>
           <w:rPr>
             <w:rStyle w:val="Hyperlink"/>
@@ -1511,7 +1660,7 @@
         </w:rPr>
         <w:t xml:space="preserve"> Y.: </w:t>
       </w:r>
-      <w:hyperlink r:id="rId9" w:history="1">
+      <w:hyperlink r:id="rId11" w:history="1">
         <w:r>
           <w:rPr>
             <w:rStyle w:val="Hyperlink"/>
@@ -1620,7 +1769,7 @@
         </w:rPr>
         <w:t xml:space="preserve"> I.: </w:t>
       </w:r>
-      <w:hyperlink r:id="rId10" w:history="1">
+      <w:hyperlink r:id="rId12" w:history="1">
         <w:r>
           <w:rPr>
             <w:rStyle w:val="Hyperlink"/>
@@ -1785,7 +1934,7 @@
         </w:rPr>
         <w:t xml:space="preserve"> </w:t>
       </w:r>
-      <w:hyperlink r:id="rId11" w:history="1">
+      <w:hyperlink r:id="rId13" w:history="1">
         <w:r>
           <w:rPr>
             <w:rStyle w:val="Hyperlink"/>
@@ -1912,35 +2061,15 @@
         <w:rPr>
           <w:rFonts w:ascii="Times New Roman" w:hAnsi="Times New Roman" w:cs="Times New Roman"/>
         </w:rPr>
-        <w:t xml:space="preserve">Liu Y., </w:t>
-      </w:r>
-      <w:r>
-        <w:rPr>
-          <w:rFonts w:ascii="Times New Roman" w:hAnsi="Times New Roman" w:cs="Times New Roman"/>
-          <w:b/>
-          <w:bCs/>
-        </w:rPr>
-        <w:t>Jia H</w:t>
-      </w:r>
-      <w:r>
-        <w:rPr>
-          <w:rFonts w:ascii="Times New Roman" w:hAnsi="Times New Roman" w:cs="Times New Roman"/>
-        </w:rPr>
-        <w:t>.</w:t>
-      </w:r>
-      <w:r>
-        <w:rPr>
-          <w:rFonts w:ascii="Times New Roman" w:hAnsi="Times New Roman" w:cs="Times New Roman"/>
-        </w:rPr>
-        <w:t xml:space="preserve">, and Han, Y.: </w:t>
-      </w:r>
-      <w:hyperlink r:id="rId12" w:history="1">
+        <w:t xml:space="preserve">Liu, Y., Jia, H., and Han, Y.: </w:t>
+      </w:r>
+      <w:hyperlink r:id="rId14" w:history="1">
         <w:r>
           <w:rPr>
             <w:rStyle w:val="Hyperlink"/>
             <w:rFonts w:ascii="Times New Roman" w:hAnsi="Times New Roman" w:cs="Times New Roman"/>
           </w:rPr>
-          <w:t>Susceptibility of Marine Warm Clouds to Aerosols in Different Monsoon Periods over the South China Sea</w:t>
+          <w:t>Susceptibility of marine warm clouds to aerosols in different monsoon periods over the South China Sea</w:t>
         </w:r>
       </w:hyperlink>
       <w:r>
@@ -1949,19 +2078,27 @@
         </w:rPr>
         <w:t xml:space="preserve">, </w:t>
       </w:r>
-      <w:proofErr w:type="spellStart"/>
-      <w:r>
-        <w:rPr>
-          <w:rFonts w:ascii="Times New Roman" w:hAnsi="Times New Roman" w:cs="Times New Roman"/>
-        </w:rPr>
-        <w:t>EGUsphere</w:t>
-      </w:r>
-      <w:proofErr w:type="spellEnd"/>
-      <w:r>
-        <w:rPr>
-          <w:rFonts w:ascii="Times New Roman" w:hAnsi="Times New Roman" w:cs="Times New Roman"/>
-        </w:rPr>
-        <w:t xml:space="preserve"> [preprint], 2026.</w:t>
+      <w:r>
+        <w:rPr>
+          <w:rFonts w:ascii="Times New Roman" w:hAnsi="Times New Roman" w:cs="Times New Roman"/>
+          <w:b/>
+          <w:bCs/>
+          <w:i/>
+          <w:iCs/>
+        </w:rPr>
+        <w:t>Atmos. Chem. Phys.</w:t>
+      </w:r>
+      <w:r>
+        <w:rPr>
+          <w:rFonts w:ascii="Times New Roman" w:hAnsi="Times New Roman" w:cs="Times New Roman"/>
+        </w:rPr>
+        <w:t>,</w:t>
+      </w:r>
+      <w:r>
+        <w:rPr>
+          <w:rFonts w:ascii="Times New Roman" w:hAnsi="Times New Roman" w:cs="Times New Roman"/>
+        </w:rPr>
+        <w:t xml:space="preserve"> 26, 9373–9392, 2026.</w:t>
       </w:r>
     </w:p>
     <w:p>
@@ -2610,7 +2747,7 @@
         </w:rPr>
         <w:t xml:space="preserve"> </w:t>
       </w:r>
-      <w:hyperlink r:id="rId13" w:history="1">
+      <w:hyperlink r:id="rId15" w:history="1">
         <w:r>
           <w:rPr>
             <w:rStyle w:val="Hyperlink"/>
@@ -2690,6 +2827,7 @@
           <w:b/>
           <w:color w:val="002060"/>
         </w:rPr>
+        <w:lastRenderedPageBreak/>
         <w:t>202</w:t>
       </w:r>
       <w:r>
@@ -2849,7 +2987,6 @@
           <w:b/>
           <w:bCs/>
         </w:rPr>
-        <w:lastRenderedPageBreak/>
         <w:t>Jia H.</w:t>
       </w:r>
       <w:r>
@@ -2894,7 +3031,7 @@
         </w:rPr>
         <w:t xml:space="preserve"> </w:t>
       </w:r>
-      <w:hyperlink r:id="rId14" w:history="1">
+      <w:hyperlink r:id="rId16" w:history="1">
         <w:r>
           <w:rPr>
             <w:rStyle w:val="Hyperlink"/>
@@ -3069,7 +3206,7 @@
         </w:rPr>
         <w:t xml:space="preserve"> </w:t>
       </w:r>
-      <w:hyperlink r:id="rId15" w:history="1">
+      <w:hyperlink r:id="rId17" w:history="1">
         <w:r>
           <w:rPr>
             <w:rStyle w:val="Hyperlink"/>
@@ -3278,7 +3415,7 @@
         </w:rPr>
         <w:t xml:space="preserve"> </w:t>
       </w:r>
-      <w:hyperlink r:id="rId16" w:history="1">
+      <w:hyperlink r:id="rId18" w:history="1">
         <w:r>
           <w:rPr>
             <w:rStyle w:val="Hyperlink"/>
@@ -3345,7 +3482,7 @@
         </w:rPr>
         <w:t xml:space="preserve">Wang Y., Li J., Fang F., Zhang P., He J., </w:t>
       </w:r>
-      <w:hyperlink r:id="rId17" w:anchor="auth-Mira_L_-P_hlker-Aff3" w:history="1">
+      <w:hyperlink r:id="rId19" w:anchor="auth-Mira_L_-P_hlker-Aff3" w:history="1">
         <w:proofErr w:type="spellStart"/>
         <w:r>
           <w:rPr>
@@ -3499,7 +3636,7 @@
         </w:rPr>
         <w:t xml:space="preserve">.: </w:t>
       </w:r>
-      <w:hyperlink r:id="rId18" w:history="1">
+      <w:hyperlink r:id="rId20" w:history="1">
         <w:r>
           <w:rPr>
             <w:rStyle w:val="Hyperlink"/>
@@ -3614,7 +3751,7 @@
         </w:rPr>
         <w:t xml:space="preserve"> </w:t>
       </w:r>
-      <w:hyperlink r:id="rId19" w:history="1">
+      <w:hyperlink r:id="rId21" w:history="1">
         <w:proofErr w:type="gramStart"/>
         <w:r>
           <w:rPr>
@@ -3810,7 +3947,7 @@
         </w:rPr>
         <w:t xml:space="preserve"> O., and Pan Z. </w:t>
       </w:r>
-      <w:hyperlink r:id="rId20" w:history="1">
+      <w:hyperlink r:id="rId22" w:history="1">
         <w:r>
           <w:rPr>
             <w:rStyle w:val="Hyperlink"/>
@@ -3917,7 +4054,7 @@
         </w:rPr>
         <w:t xml:space="preserve">, M. Sand, T. Takemura, A. Voulgarakis, and C. D. Wells: </w:t>
       </w:r>
-      <w:hyperlink r:id="rId21" w:history="1">
+      <w:hyperlink r:id="rId23" w:history="1">
         <w:r>
           <w:rPr>
             <w:rStyle w:val="Hyperlink"/>
@@ -4049,7 +4186,7 @@
         </w:rPr>
         <w:t xml:space="preserve">, &amp; Quaas, J. </w:t>
       </w:r>
-      <w:hyperlink r:id="rId22" w:history="1">
+      <w:hyperlink r:id="rId24" w:history="1">
         <w:r>
           <w:rPr>
             <w:rStyle w:val="Hyperlink"/>
@@ -4144,7 +4281,7 @@
         </w:rPr>
         <w:t xml:space="preserve">, O.: </w:t>
       </w:r>
-      <w:hyperlink r:id="rId23" w:history="1">
+      <w:hyperlink r:id="rId25" w:history="1">
         <w:r>
           <w:rPr>
             <w:rStyle w:val="Hyperlink"/>
@@ -4257,7 +4394,7 @@
         </w:rPr>
         <w:t xml:space="preserve">, Z., Loeb, N. G., Ma, X., Naik, V., Paulot, F., Stier, P., Wild, M., Myhre, G., and Schulz, M.: </w:t>
       </w:r>
-      <w:hyperlink r:id="rId24" w:history="1">
+      <w:hyperlink r:id="rId26" w:history="1">
         <w:r>
           <w:rPr>
             <w:rStyle w:val="Hyperlink"/>
@@ -4347,7 +4484,7 @@
       <w:r>
         <w:t xml:space="preserve"> </w:t>
       </w:r>
-      <w:hyperlink r:id="rId25" w:history="1">
+      <w:hyperlink r:id="rId27" w:history="1">
         <w:r>
           <w:rPr>
             <w:rStyle w:val="Hyperlink"/>
@@ -4447,6 +4584,7 @@
         <w:rPr>
           <w:rFonts w:ascii="Times New Roman" w:hAnsi="Times New Roman" w:cs="Times New Roman"/>
         </w:rPr>
+        <w:lastRenderedPageBreak/>
         <w:t>Chaibou</w:t>
       </w:r>
       <w:proofErr w:type="spellEnd"/>
@@ -4577,7 +4715,6 @@
           <w:rFonts w:ascii="Times New Roman" w:hAnsi="Times New Roman" w:cs="Times New Roman"/>
           <w:b/>
         </w:rPr>
-        <w:lastRenderedPageBreak/>
         <w:t>Jia H.</w:t>
       </w:r>
       <w:r>
@@ -5792,6 +5929,7 @@
         <w:rPr>
           <w:rFonts w:ascii="Times New Roman" w:hAnsi="Times New Roman" w:cs="Times New Roman"/>
         </w:rPr>
+        <w:lastRenderedPageBreak/>
         <w:t xml:space="preserve">2024 </w:t>
       </w:r>
       <w:proofErr w:type="gramStart"/>
@@ -5982,7 +6120,6 @@
         <w:rPr>
           <w:rFonts w:ascii="Times New Roman" w:hAnsi="Times New Roman" w:cs="Times New Roman"/>
         </w:rPr>
-        <w:lastRenderedPageBreak/>
         <w:tab/>
       </w:r>
       <w:r>
@@ -6496,23 +6633,7 @@
           <w:i/>
           <w:iCs/>
         </w:rPr>
-        <w:t>Atmospheric Chemistry and Physics</w:t>
-      </w:r>
-      <w:r>
-        <w:rPr>
-          <w:rFonts w:ascii="Times New Roman" w:hAnsi="Times New Roman" w:cs="Times New Roman"/>
-          <w:i/>
-          <w:iCs/>
-        </w:rPr>
-        <w:t>’</w:t>
-      </w:r>
-      <w:r>
-        <w:rPr>
-          <w:rFonts w:ascii="Times New Roman" w:hAnsi="Times New Roman" w:cs="Times New Roman"/>
-          <w:i/>
-          <w:iCs/>
-        </w:rPr>
-        <w:t xml:space="preserve">  </w:t>
+        <w:t xml:space="preserve">Atmospheric Chemistry and Physics’  </w:t>
       </w:r>
     </w:p>
     <w:p>
@@ -6801,7 +6922,7 @@
         </w:rPr>
         <w:t xml:space="preserve"> (</w:t>
       </w:r>
-      <w:hyperlink r:id="rId26" w:history="1">
+      <w:hyperlink r:id="rId28" w:history="1">
         <w:r>
           <w:rPr>
             <w:rStyle w:val="Hyperlink"/>
@@ -7757,6 +7878,7 @@
           <w:sz w:val="24"/>
           <w:szCs w:val="24"/>
         </w:rPr>
+        <w:lastRenderedPageBreak/>
         <w:t>Talks</w:t>
       </w:r>
     </w:p>
@@ -7899,7 +8021,6 @@
         <w:rPr>
           <w:rFonts w:ascii="Times New Roman" w:hAnsi="Times New Roman" w:cs="Times New Roman"/>
         </w:rPr>
-        <w:lastRenderedPageBreak/>
         <w:t>202</w:t>
       </w:r>
       <w:r>
@@ -10632,4 +10753,16 @@
     </a:ext>
   </a:extLst>
 </a:theme>
+</file>
+
+<file path=customXml/item1.xml><?xml version="1.0" encoding="utf-8"?>
+<b:Sources xmlns:b="http://schemas.openxmlformats.org/officeDocument/2006/bibliography" xmlns="http://schemas.openxmlformats.org/officeDocument/2006/bibliography" SelectedStyle="/APASixthEditionOfficeOnline.xsl" StyleName="APA" Version="6"/>
+</file>
+
+<file path=customXml/itemProps1.xml><?xml version="1.0" encoding="utf-8"?>
+<ds:datastoreItem xmlns:ds="http://schemas.openxmlformats.org/officeDocument/2006/customXml" ds:itemID="{0F658F75-7402-9E4C-8328-A71BF927399E}">
+  <ds:schemaRefs>
+    <ds:schemaRef ds:uri="http://schemas.openxmlformats.org/officeDocument/2006/bibliography"/>
+  </ds:schemaRefs>
+</ds:datastoreItem>
 </file>
</xml_diff>